<commit_message>
BDR querys 3 12/03/26
</commit_message>
<xml_diff>
--- a/BDR practica querys2.docx
+++ b/BDR practica querys2.docx
@@ -9,6 +9,10 @@
     </w:p>
     <w:p>
       <w:r>
+        <w:rPr>
+          <w:noProof/>
+          <w:lang w:eastAsia="es-MX"/>
+        </w:rPr>
         <w:drawing>
           <wp:inline distT="0" distB="0" distL="0" distR="0" wp14:anchorId="7D4AEC28" wp14:editId="45CA623E">
             <wp:extent cx="5612130" cy="3278505"/>
@@ -46,8 +50,25 @@
         </w:drawing>
       </w:r>
     </w:p>
-    <w:p>
-      <w:r>
+    <w:p/>
+    <w:p/>
+    <w:p/>
+    <w:p/>
+    <w:p/>
+    <w:p/>
+    <w:p/>
+    <w:p/>
+    <w:p/>
+    <w:p/>
+    <w:p/>
+    <w:p/>
+    <w:p/>
+    <w:p/>
+    <w:p/>
+    <w:p/>
+    <w:p>
+      <w:r>
+        <w:lastRenderedPageBreak/>
         <w:t xml:space="preserve">Mostrar las películas ordenadas de mayor a menor </w:t>
       </w:r>
       <w:r>
@@ -56,7 +77,10 @@
     </w:p>
     <w:p>
       <w:r>
-        <w:lastRenderedPageBreak/>
+        <w:rPr>
+          <w:noProof/>
+          <w:lang w:eastAsia="es-MX"/>
+        </w:rPr>
         <w:drawing>
           <wp:inline distT="0" distB="0" distL="0" distR="0" wp14:anchorId="324B6BDB" wp14:editId="313DCCF0">
             <wp:extent cx="5612130" cy="7355840"/>
@@ -94,8 +118,11 @@
         </w:drawing>
       </w:r>
     </w:p>
-    <w:p>
-      <w:r>
+    <w:p/>
+    <w:p/>
+    <w:p>
+      <w:r>
+        <w:lastRenderedPageBreak/>
         <w:t>Mostrar las películas que pertenecen a la categoría “</w:t>
       </w:r>
       <w:proofErr w:type="spellStart"/>
@@ -109,7 +136,10 @@
     </w:p>
     <w:p>
       <w:r>
-        <w:lastRenderedPageBreak/>
+        <w:rPr>
+          <w:noProof/>
+          <w:lang w:eastAsia="es-MX"/>
+        </w:rPr>
         <w:drawing>
           <wp:inline distT="0" distB="0" distL="0" distR="0" wp14:anchorId="32A7DCD9" wp14:editId="0A688CA6">
             <wp:extent cx="5612130" cy="3686175"/>
@@ -154,6 +184,10 @@
     </w:p>
     <w:p>
       <w:r>
+        <w:rPr>
+          <w:noProof/>
+          <w:lang w:eastAsia="es-MX"/>
+        </w:rPr>
         <w:drawing>
           <wp:inline distT="0" distB="0" distL="0" distR="0" wp14:anchorId="7F4B4609" wp14:editId="75F02CBB">
             <wp:extent cx="5612130" cy="3376295"/>
@@ -191,18 +225,23 @@
         </w:drawing>
       </w:r>
     </w:p>
-    <w:p>
-      <w:r>
+    <w:p/>
+    <w:p>
+      <w:r>
+        <w:lastRenderedPageBreak/>
         <w:t>Mostrar los pagos realizados por los clientes</w:t>
       </w:r>
     </w:p>
     <w:p>
       <w:r>
-        <w:lastRenderedPageBreak/>
+        <w:rPr>
+          <w:noProof/>
+          <w:lang w:eastAsia="es-MX"/>
+        </w:rPr>
         <w:drawing>
           <wp:inline distT="0" distB="0" distL="0" distR="0" wp14:anchorId="497A2F0D" wp14:editId="12746E2C">
-            <wp:extent cx="5612130" cy="4017010"/>
-            <wp:effectExtent l="0" t="0" r="7620" b="2540"/>
+            <wp:extent cx="6153150" cy="4404257"/>
+            <wp:effectExtent l="0" t="0" r="0" b="0"/>
             <wp:docPr id="5" name="Imagen 5"/>
             <wp:cNvGraphicFramePr>
               <a:graphicFrameLocks xmlns:a="http://schemas.openxmlformats.org/drawingml/2006/main" noChangeAspect="1"/>
@@ -223,7 +262,7 @@
                   <pic:spPr>
                     <a:xfrm>
                       <a:off x="0" y="0"/>
-                      <a:ext cx="5612130" cy="4017010"/>
+                      <a:ext cx="6160692" cy="4409656"/>
                     </a:xfrm>
                     <a:prstGeom prst="rect">
                       <a:avLst/>
@@ -236,13 +275,30 @@
         </w:drawing>
       </w:r>
     </w:p>
-    <w:p>
-      <w:r>
+    <w:p/>
+    <w:p/>
+    <w:p/>
+    <w:p/>
+    <w:p/>
+    <w:p/>
+    <w:p/>
+    <w:p/>
+    <w:p/>
+    <w:p/>
+    <w:p/>
+    <w:p/>
+    <w:p>
+      <w:r>
+        <w:lastRenderedPageBreak/>
         <w:t>Cantidad de gastado de cada cliente</w:t>
       </w:r>
     </w:p>
     <w:p>
       <w:r>
+        <w:rPr>
+          <w:noProof/>
+          <w:lang w:eastAsia="es-MX"/>
+        </w:rPr>
         <w:drawing>
           <wp:inline distT="0" distB="0" distL="0" distR="0" wp14:anchorId="07984656" wp14:editId="100C14DB">
             <wp:extent cx="5612130" cy="3383280"/>
@@ -278,6 +334,116 @@
             </a:graphic>
           </wp:inline>
         </w:drawing>
+      </w:r>
+    </w:p>
+    <w:p>
+      <w:r>
+        <w:t>Mostrar cuantos clientes hay por tienda</w:t>
+      </w:r>
+    </w:p>
+    <w:p>
+      <w:r>
+        <w:drawing>
+          <wp:inline distT="0" distB="0" distL="0" distR="0" wp14:anchorId="4EC09711" wp14:editId="40B79FD9">
+            <wp:extent cx="5612130" cy="1645920"/>
+            <wp:effectExtent l="0" t="0" r="7620" b="0"/>
+            <wp:docPr id="9" name="Imagen 9"/>
+            <wp:cNvGraphicFramePr>
+              <a:graphicFrameLocks xmlns:a="http://schemas.openxmlformats.org/drawingml/2006/main" noChangeAspect="1"/>
+            </wp:cNvGraphicFramePr>
+            <a:graphic xmlns:a="http://schemas.openxmlformats.org/drawingml/2006/main">
+              <a:graphicData uri="http://schemas.openxmlformats.org/drawingml/2006/picture">
+                <pic:pic xmlns:pic="http://schemas.openxmlformats.org/drawingml/2006/picture">
+                  <pic:nvPicPr>
+                    <pic:cNvPr id="1" name=""/>
+                    <pic:cNvPicPr/>
+                  </pic:nvPicPr>
+                  <pic:blipFill>
+                    <a:blip r:embed="rId10"/>
+                    <a:stretch>
+                      <a:fillRect/>
+                    </a:stretch>
+                  </pic:blipFill>
+                  <pic:spPr>
+                    <a:xfrm>
+                      <a:off x="0" y="0"/>
+                      <a:ext cx="5612130" cy="1645920"/>
+                    </a:xfrm>
+                    <a:prstGeom prst="rect">
+                      <a:avLst/>
+                    </a:prstGeom>
+                  </pic:spPr>
+                </pic:pic>
+              </a:graphicData>
+            </a:graphic>
+          </wp:inline>
+        </w:drawing>
+      </w:r>
+    </w:p>
+    <w:p/>
+    <w:p/>
+    <w:p/>
+    <w:p/>
+    <w:p/>
+    <w:p/>
+    <w:p/>
+    <w:p/>
+    <w:p>
+      <w:r>
+        <w:lastRenderedPageBreak/>
+        <w:t>Contar cuantos actores hay en cada película</w:t>
+      </w:r>
+    </w:p>
+    <w:p>
+      <w:r>
+        <w:drawing>
+          <wp:inline distT="0" distB="0" distL="0" distR="0" wp14:anchorId="12FF8631" wp14:editId="62F25C58">
+            <wp:extent cx="5612130" cy="2783205"/>
+            <wp:effectExtent l="0" t="0" r="7620" b="0"/>
+            <wp:docPr id="8" name="Imagen 8"/>
+            <wp:cNvGraphicFramePr>
+              <a:graphicFrameLocks xmlns:a="http://schemas.openxmlformats.org/drawingml/2006/main" noChangeAspect="1"/>
+            </wp:cNvGraphicFramePr>
+            <a:graphic xmlns:a="http://schemas.openxmlformats.org/drawingml/2006/main">
+              <a:graphicData uri="http://schemas.openxmlformats.org/drawingml/2006/picture">
+                <pic:pic xmlns:pic="http://schemas.openxmlformats.org/drawingml/2006/picture">
+                  <pic:nvPicPr>
+                    <pic:cNvPr id="1" name=""/>
+                    <pic:cNvPicPr/>
+                  </pic:nvPicPr>
+                  <pic:blipFill>
+                    <a:blip r:embed="rId11"/>
+                    <a:stretch>
+                      <a:fillRect/>
+                    </a:stretch>
+                  </pic:blipFill>
+                  <pic:spPr>
+                    <a:xfrm>
+                      <a:off x="0" y="0"/>
+                      <a:ext cx="5612130" cy="2783205"/>
+                    </a:xfrm>
+                    <a:prstGeom prst="rect">
+                      <a:avLst/>
+                    </a:prstGeom>
+                  </pic:spPr>
+                </pic:pic>
+              </a:graphicData>
+            </a:graphic>
+          </wp:inline>
+        </w:drawing>
+      </w:r>
+    </w:p>
+    <w:p>
+      <w:r>
+        <w:t xml:space="preserve">Mostrar las 5 </w:t>
+      </w:r>
+      <w:proofErr w:type="spellStart"/>
+      <w:r>
+        <w:t>peliculas</w:t>
+      </w:r>
+      <w:proofErr w:type="spellEnd"/>
+      <w:r>
+        <w:t xml:space="preserve"> mas rentadas</w:t>
       </w:r>
       <w:bookmarkStart w:id="0" w:name="_GoBack"/>
       <w:bookmarkEnd w:id="0"/>

</xml_diff>